<commit_message>
IRB #3: no compensation for UMaine employees, per IRB #2 v9
Cyril's decision on the open employee-compensation question: adopt the
approach the board accepted on IRB #2 v9 — UMaine-employed instructors
are not compensated and take part on the same terms otherwise. Applied
in the narrative, consent form, and recruitment texts; report and
backlog updated (5 decisions remain).

Co-Authored-By: Claude Fable 5 <noreply@anthropic.com>
Claude-Session: https://claude.ai/code/session_01BiiD1nM2L5EBkrZEqhexWB
</commit_message>
<xml_diff>
--- a/irb3-instructor-adoption/CURRENT/IRB3_Protocol_v2_ORA_RESPONSE.docx
+++ b/irb3-instructor-adoption/CURRENT/IRB3_Protocol_v2_ORA_RESPONSE.docx
@@ -1439,7 +1439,7 @@
           <w:b/>
           <w:color w:val="C00000"/>
         </w:rPr>
-        <w:t xml:space="preserve">To clarify the handling of compensation for University of Maine employees: University of Maine policy does not permit gift cards to be used to compensate University employees, so instructors employed by the University of Maine receive the same dollar amount as a direct payment processed by the University's business administration office rather than as a gift card, after they fill out a separate form providing the contact information that office needs to process the payment. Their response to that form is not connected to their research responses.</w:t>
+        <w:t xml:space="preserve">To clarify the handling of compensation for University of Maine employees: University of Maine policy does not permit gift cards to be used to compensate University employees, so instructors employed by the University of Maine are not offered compensation; they take part on the same terms in every other respect. Instructors at other institutions are offered the gift cards described above.</w:t>
       </w:r>
     </w:p>
     <w:p>
@@ -2102,7 +2102,7 @@
           <w:b/>
           <w:color w:val="C00000"/>
         </w:rPr>
-        <w:t xml:space="preserve">Because University of Maine policy does not permit gift cards to be used to compensate University employees, if you are a UMaine employee you will receive the same dollar amount as a direct payment processed by the University's business administration office instead of a gift card, after you fill out a separate form to provide contact information for that office to process the payment.</w:t>
+        <w:t xml:space="preserve">Because University of Maine policy does not permit gift cards to be used to compensate University employees, if you are an employee of the University of Maine you will not be offered a gift card or other compensation; you take part on the same terms in every other respect.</w:t>
       </w:r>
     </w:p>
     <w:p>
@@ -2128,14 +2128,14 @@
         <w:t xml:space="preserve">submit</w:t>
       </w:r>
       <w:r>
-        <w:t xml:space="preserve">, you will receive a $10 electronic VISA gift card or deposit within 2 business days of submission, via the same process above. </w:t>
-      </w:r>
-      <w:r>
-        <w:rPr>
-          <w:b/>
-          <w:color w:val="C00000"/>
-        </w:rPr>
-        <w:t xml:space="preserve">You may skip the occasional question and still receive compensation for a submitted survey. You will receive one gift card (or payment) per survey invitation.</w:t>
+        <w:t xml:space="preserve">, you will receive a $10 electronic VISA gift card within 2 business days of submission, via the same process above. </w:t>
+      </w:r>
+      <w:r>
+        <w:rPr>
+          <w:b/>
+          <w:color w:val="C00000"/>
+        </w:rPr>
+        <w:t xml:space="preserve">You may skip the occasional question and still receive compensation for a submitted survey. You will receive one gift card per survey invitation.</w:t>
       </w:r>
       <w:r>
         <w:t xml:space="preserve"> </w:t>
@@ -2836,7 +2836,7 @@
           <w:b/>
           <w:color w:val="C00000"/>
         </w:rPr>
-        <w:t xml:space="preserve">For each workshop session you participate in, you will be offered a $25 electronic VISA gift card (University of Maine employees receive an equivalent payment through the University instead, as gift cards cannot be issued to employees).</w:t>
+        <w:t xml:space="preserve">For each workshop session you participate in, you will be offered a $25 electronic VISA gift card (University policy does not permit gift cards for University of Maine employees, so UMaine-employed instructors take part without compensation).</w:t>
       </w:r>
       <w:r>
         <w:rPr>
@@ -2983,7 +2983,7 @@
           <w:b/>
           <w:color w:val="C00000"/>
         </w:rPr>
-        <w:t xml:space="preserve">For this survey, you will receive a $10 electronic VISA gift card within 2 business days of submission — one gift card per survey invitation (University of Maine employees receive an equivalent payment through the University instead). If you have any questions, contact Greg Nelson, Assistant Professor, University of Maine (gregory.nelson@maine.edu) or Cyril Agbewali-Koku, PhD Student (cyril.agbewalikoku@maine.edu).</w:t>
+        <w:t xml:space="preserve">For this survey, you will receive a $10 electronic VISA gift card within 2 business days of submission — one gift card per survey invitation (University policy does not permit gift cards for University of Maine employees, who take part without compensation). If you have any questions, contact Greg Nelson, Assistant Professor, University of Maine (gregory.nelson@maine.edu) or Cyril Agbewali-Koku, PhD Student (cyril.agbewalikoku@maine.edu).</w:t>
       </w:r>
       <w:r>
         <w:rPr>
@@ -3061,7 +3061,7 @@
           <w:b/>
           <w:color w:val="C00000"/>
         </w:rPr>
-        <w:t xml:space="preserve">(University of Maine employees receive an equivalent payment through the University instead). If you have any questions, contact Greg Nelson, Assistant Professor, University of Maine (gregory.nelson@maine.edu) or Cyril Agbewali-Koku, PhD Student (cyril.agbewalikoku@maine.edu).</w:t>
+        <w:t xml:space="preserve">(University policy does not permit gift cards for University of Maine employees, who take part without compensation). If you have any questions, contact Greg Nelson, Assistant Professor, University of Maine (gregory.nelson@maine.edu) or Cyril Agbewali-Koku, PhD Student (cyril.agbewalikoku@maine.edu).</w:t>
       </w:r>
       <w:r>
         <w:rPr>

</xml_diff>